<commit_message>
DSA LAB AND flames
</commit_message>
<xml_diff>
--- a/html/document of webd lab/Program No - Copy.docx
+++ b/html/document of webd lab/Program No - Copy.docx
@@ -1656,25 +1656,7 @@
           <w:lang w:eastAsia="en-IN"/>
         </w:rPr>
         <w:lastRenderedPageBreak/>
-        <w:t>Program No.0</w:t>
-      </w:r>
-      <w:r>
-        <w:rPr>
-          <w:rFonts w:ascii="Cascadia Code" w:eastAsia="Times New Roman" w:hAnsi="Cascadia Code" w:cs="Cascadia Code"/>
-          <w:sz w:val="21"/>
-          <w:szCs w:val="21"/>
-          <w:lang w:eastAsia="en-IN"/>
-        </w:rPr>
-        <w:t>3</w:t>
-      </w:r>
-      <w:r>
-        <w:rPr>
-          <w:rFonts w:ascii="Cascadia Code" w:eastAsia="Times New Roman" w:hAnsi="Cascadia Code" w:cs="Cascadia Code"/>
-          <w:sz w:val="21"/>
-          <w:szCs w:val="21"/>
-          <w:lang w:eastAsia="en-IN"/>
-        </w:rPr>
-        <w:t xml:space="preserve">: </w:t>
+        <w:t xml:space="preserve">Program No.03: </w:t>
       </w:r>
     </w:p>
     <w:p>
@@ -2642,6 +2624,7 @@
           <w:rFonts w:ascii="Cascadia Code" w:eastAsia="Times New Roman" w:hAnsi="Cascadia Code" w:cs="Cascadia Code"/>
           <w:b/>
           <w:bCs/>
+          <w:noProof/>
           <w:sz w:val="24"/>
           <w:szCs w:val="24"/>
           <w:lang w:eastAsia="en-IN"/>
@@ -2702,6 +2685,1205 @@
           <w:lang w:eastAsia="en-IN"/>
         </w:rPr>
       </w:pPr>
+    </w:p>
+    <w:p>
+      <w:pPr>
+        <w:shd w:val="clear" w:color="auto" w:fill="FFFFFF" w:themeFill="background1"/>
+        <w:spacing w:after="0" w:line="285" w:lineRule="atLeast"/>
+        <w:rPr>
+          <w:rFonts w:ascii="Cascadia Code" w:eastAsia="Times New Roman" w:hAnsi="Cascadia Code" w:cs="Cascadia Code"/>
+          <w:b/>
+          <w:bCs/>
+          <w:sz w:val="24"/>
+          <w:szCs w:val="24"/>
+          <w:u w:val="single"/>
+          <w:lang w:eastAsia="en-IN"/>
+        </w:rPr>
+      </w:pPr>
+    </w:p>
+    <w:p>
+      <w:pPr>
+        <w:shd w:val="clear" w:color="auto" w:fill="FFFFFF" w:themeFill="background1"/>
+        <w:spacing w:after="0" w:line="285" w:lineRule="atLeast"/>
+        <w:rPr>
+          <w:rFonts w:ascii="Cascadia Code" w:eastAsia="Times New Roman" w:hAnsi="Cascadia Code" w:cs="Cascadia Code"/>
+          <w:b/>
+          <w:bCs/>
+          <w:sz w:val="24"/>
+          <w:szCs w:val="24"/>
+          <w:u w:val="single"/>
+          <w:lang w:eastAsia="en-IN"/>
+        </w:rPr>
+      </w:pPr>
+    </w:p>
+    <w:p>
+      <w:pPr>
+        <w:shd w:val="clear" w:color="auto" w:fill="FFFFFF" w:themeFill="background1"/>
+        <w:spacing w:after="0" w:line="285" w:lineRule="atLeast"/>
+        <w:rPr>
+          <w:rFonts w:ascii="Cascadia Code" w:eastAsia="Times New Roman" w:hAnsi="Cascadia Code" w:cs="Cascadia Code"/>
+          <w:b/>
+          <w:bCs/>
+          <w:sz w:val="24"/>
+          <w:szCs w:val="24"/>
+          <w:u w:val="single"/>
+          <w:lang w:eastAsia="en-IN"/>
+        </w:rPr>
+      </w:pPr>
+    </w:p>
+    <w:p>
+      <w:pPr>
+        <w:shd w:val="clear" w:color="auto" w:fill="FFFFFF" w:themeFill="background1"/>
+        <w:spacing w:after="0" w:line="285" w:lineRule="atLeast"/>
+        <w:rPr>
+          <w:rFonts w:ascii="Cascadia Code" w:eastAsia="Times New Roman" w:hAnsi="Cascadia Code" w:cs="Cascadia Code"/>
+          <w:b/>
+          <w:bCs/>
+          <w:sz w:val="24"/>
+          <w:szCs w:val="24"/>
+          <w:u w:val="single"/>
+          <w:lang w:eastAsia="en-IN"/>
+        </w:rPr>
+      </w:pPr>
+    </w:p>
+    <w:p>
+      <w:pPr>
+        <w:shd w:val="clear" w:color="auto" w:fill="FFFFFF" w:themeFill="background1"/>
+        <w:spacing w:after="0" w:line="285" w:lineRule="atLeast"/>
+        <w:rPr>
+          <w:rFonts w:ascii="Cascadia Code" w:eastAsia="Times New Roman" w:hAnsi="Cascadia Code" w:cs="Cascadia Code"/>
+          <w:b/>
+          <w:bCs/>
+          <w:sz w:val="24"/>
+          <w:szCs w:val="24"/>
+          <w:u w:val="single"/>
+          <w:lang w:eastAsia="en-IN"/>
+        </w:rPr>
+      </w:pPr>
+    </w:p>
+    <w:p>
+      <w:pPr>
+        <w:rPr>
+          <w:rFonts w:ascii="Cascadia Code" w:eastAsia="Times New Roman" w:hAnsi="Cascadia Code" w:cs="Cascadia Code"/>
+          <w:b/>
+          <w:bCs/>
+          <w:sz w:val="24"/>
+          <w:szCs w:val="24"/>
+          <w:u w:val="single"/>
+          <w:lang w:eastAsia="en-IN"/>
+        </w:rPr>
+      </w:pPr>
+      <w:r>
+        <w:rPr>
+          <w:rFonts w:ascii="Cascadia Code" w:eastAsia="Times New Roman" w:hAnsi="Cascadia Code" w:cs="Cascadia Code"/>
+          <w:b/>
+          <w:bCs/>
+          <w:sz w:val="24"/>
+          <w:szCs w:val="24"/>
+          <w:u w:val="single"/>
+          <w:lang w:eastAsia="en-IN"/>
+        </w:rPr>
+        <w:br w:type="page"/>
+      </w:r>
+    </w:p>
+    <w:p>
+      <w:pPr>
+        <w:pBdr>
+          <w:bottom w:val="single" w:sz="12" w:space="0" w:color="auto"/>
+        </w:pBdr>
+        <w:shd w:val="clear" w:color="auto" w:fill="DBDBDB"/>
+        <w:spacing w:after="0" w:line="285" w:lineRule="atLeast"/>
+        <w:rPr>
+          <w:rFonts w:ascii="Cascadia Code" w:eastAsia="Times New Roman" w:hAnsi="Cascadia Code" w:cs="Cascadia Code"/>
+          <w:sz w:val="21"/>
+          <w:szCs w:val="21"/>
+          <w:lang w:eastAsia="en-IN"/>
+        </w:rPr>
+      </w:pPr>
+      <w:r>
+        <w:rPr>
+          <w:rFonts w:ascii="Cascadia Code" w:eastAsia="Times New Roman" w:hAnsi="Cascadia Code" w:cs="Cascadia Code"/>
+          <w:b/>
+          <w:bCs/>
+          <w:sz w:val="24"/>
+          <w:szCs w:val="24"/>
+          <w:u w:val="single"/>
+          <w:lang w:eastAsia="en-IN"/>
+        </w:rPr>
+        <w:lastRenderedPageBreak/>
+        <w:t>Program No.0</w:t>
+      </w:r>
+      <w:r>
+        <w:rPr>
+          <w:rFonts w:ascii="Cascadia Code" w:eastAsia="Times New Roman" w:hAnsi="Cascadia Code" w:cs="Cascadia Code"/>
+          <w:b/>
+          <w:bCs/>
+          <w:sz w:val="24"/>
+          <w:szCs w:val="24"/>
+          <w:u w:val="single"/>
+          <w:lang w:eastAsia="en-IN"/>
+        </w:rPr>
+        <w:t>4</w:t>
+      </w:r>
+      <w:r>
+        <w:rPr>
+          <w:rFonts w:ascii="Cascadia Code" w:eastAsia="Times New Roman" w:hAnsi="Cascadia Code" w:cs="Cascadia Code"/>
+          <w:b/>
+          <w:bCs/>
+          <w:sz w:val="24"/>
+          <w:szCs w:val="24"/>
+          <w:u w:val="single"/>
+          <w:lang w:eastAsia="en-IN"/>
+        </w:rPr>
+        <w:t>:</w:t>
+      </w:r>
+      <w:r>
+        <w:rPr>
+          <w:rFonts w:ascii="Cascadia Code" w:eastAsia="Times New Roman" w:hAnsi="Cascadia Code" w:cs="Cascadia Code"/>
+          <w:sz w:val="21"/>
+          <w:szCs w:val="21"/>
+          <w:lang w:eastAsia="en-IN"/>
+        </w:rPr>
+        <w:t xml:space="preserve"> create a webpage in html using html tags for table, rows, table data and table headings of any 3 students</w:t>
+      </w:r>
+    </w:p>
+    <w:p>
+      <w:pPr>
+        <w:shd w:val="clear" w:color="auto" w:fill="FFFFFF" w:themeFill="background1"/>
+        <w:spacing w:after="0" w:line="285" w:lineRule="atLeast"/>
+        <w:rPr>
+          <w:rFonts w:ascii="Cascadia Code" w:eastAsia="Times New Roman" w:hAnsi="Cascadia Code" w:cs="Cascadia Code"/>
+          <w:sz w:val="21"/>
+          <w:szCs w:val="21"/>
+          <w:lang w:eastAsia="en-IN"/>
+        </w:rPr>
+      </w:pPr>
+    </w:p>
+    <w:p>
+      <w:pPr>
+        <w:shd w:val="clear" w:color="auto" w:fill="FFFFFF" w:themeFill="background1"/>
+        <w:spacing w:after="0" w:line="285" w:lineRule="atLeast"/>
+        <w:rPr>
+          <w:rFonts w:ascii="Cascadia Code" w:eastAsia="Times New Roman" w:hAnsi="Cascadia Code" w:cs="Cascadia Code"/>
+          <w:b/>
+          <w:bCs/>
+          <w:sz w:val="24"/>
+          <w:szCs w:val="24"/>
+          <w:u w:val="single"/>
+          <w:lang w:eastAsia="en-IN"/>
+        </w:rPr>
+      </w:pPr>
+      <w:r>
+        <w:rPr>
+          <w:rFonts w:ascii="Cascadia Code" w:eastAsia="Times New Roman" w:hAnsi="Cascadia Code" w:cs="Cascadia Code"/>
+          <w:b/>
+          <w:bCs/>
+          <w:sz w:val="24"/>
+          <w:szCs w:val="24"/>
+          <w:u w:val="single"/>
+          <w:lang w:eastAsia="en-IN"/>
+        </w:rPr>
+        <w:t>CODE:</w:t>
+      </w:r>
+    </w:p>
+    <w:p>
+      <w:pPr>
+        <w:shd w:val="clear" w:color="auto" w:fill="DBDBDB"/>
+        <w:spacing w:after="0" w:line="285" w:lineRule="atLeast"/>
+        <w:rPr>
+          <w:rFonts w:ascii="Cascadia Code" w:eastAsia="Times New Roman" w:hAnsi="Cascadia Code" w:cs="Cascadia Code"/>
+          <w:sz w:val="21"/>
+          <w:szCs w:val="21"/>
+          <w:lang w:eastAsia="en-IN"/>
+        </w:rPr>
+      </w:pPr>
+      <w:r>
+        <w:rPr>
+          <w:rFonts w:ascii="Cascadia Code" w:eastAsia="Times New Roman" w:hAnsi="Cascadia Code" w:cs="Cascadia Code"/>
+          <w:sz w:val="21"/>
+          <w:szCs w:val="21"/>
+          <w:lang w:eastAsia="en-IN"/>
+        </w:rPr>
+        <w:t>&lt;!DOCTYPE html&gt;</w:t>
+      </w:r>
+    </w:p>
+    <w:p>
+      <w:pPr>
+        <w:shd w:val="clear" w:color="auto" w:fill="DBDBDB"/>
+        <w:spacing w:after="0" w:line="285" w:lineRule="atLeast"/>
+        <w:rPr>
+          <w:rFonts w:ascii="Cascadia Code" w:eastAsia="Times New Roman" w:hAnsi="Cascadia Code" w:cs="Cascadia Code"/>
+          <w:sz w:val="21"/>
+          <w:szCs w:val="21"/>
+          <w:lang w:eastAsia="en-IN"/>
+        </w:rPr>
+      </w:pPr>
+      <w:r>
+        <w:rPr>
+          <w:rFonts w:ascii="Cascadia Code" w:eastAsia="Times New Roman" w:hAnsi="Cascadia Code" w:cs="Cascadia Code"/>
+          <w:sz w:val="21"/>
+          <w:szCs w:val="21"/>
+          <w:lang w:eastAsia="en-IN"/>
+        </w:rPr>
+        <w:t>&lt;html lang="</w:t>
+      </w:r>
+      <w:proofErr w:type="spellStart"/>
+      <w:r>
+        <w:rPr>
+          <w:rFonts w:ascii="Cascadia Code" w:eastAsia="Times New Roman" w:hAnsi="Cascadia Code" w:cs="Cascadia Code"/>
+          <w:sz w:val="21"/>
+          <w:szCs w:val="21"/>
+          <w:lang w:eastAsia="en-IN"/>
+        </w:rPr>
+        <w:t>en</w:t>
+      </w:r>
+      <w:proofErr w:type="spellEnd"/>
+      <w:r>
+        <w:rPr>
+          <w:rFonts w:ascii="Cascadia Code" w:eastAsia="Times New Roman" w:hAnsi="Cascadia Code" w:cs="Cascadia Code"/>
+          <w:sz w:val="21"/>
+          <w:szCs w:val="21"/>
+          <w:lang w:eastAsia="en-IN"/>
+        </w:rPr>
+        <w:t>"&gt;</w:t>
+      </w:r>
+    </w:p>
+    <w:p>
+      <w:pPr>
+        <w:shd w:val="clear" w:color="auto" w:fill="DBDBDB"/>
+        <w:spacing w:after="0" w:line="285" w:lineRule="atLeast"/>
+        <w:rPr>
+          <w:rFonts w:ascii="Cascadia Code" w:eastAsia="Times New Roman" w:hAnsi="Cascadia Code" w:cs="Cascadia Code"/>
+          <w:sz w:val="21"/>
+          <w:szCs w:val="21"/>
+          <w:lang w:eastAsia="en-IN"/>
+        </w:rPr>
+      </w:pPr>
+      <w:r>
+        <w:rPr>
+          <w:rFonts w:ascii="Cascadia Code" w:eastAsia="Times New Roman" w:hAnsi="Cascadia Code" w:cs="Cascadia Code"/>
+          <w:sz w:val="21"/>
+          <w:szCs w:val="21"/>
+          <w:lang w:eastAsia="en-IN"/>
+        </w:rPr>
+        <w:t>&lt;head&gt;</w:t>
+      </w:r>
+    </w:p>
+    <w:p>
+      <w:pPr>
+        <w:shd w:val="clear" w:color="auto" w:fill="DBDBDB"/>
+        <w:spacing w:after="0" w:line="285" w:lineRule="atLeast"/>
+        <w:rPr>
+          <w:rFonts w:ascii="Cascadia Code" w:eastAsia="Times New Roman" w:hAnsi="Cascadia Code" w:cs="Cascadia Code"/>
+          <w:sz w:val="21"/>
+          <w:szCs w:val="21"/>
+          <w:lang w:eastAsia="en-IN"/>
+        </w:rPr>
+      </w:pPr>
+      <w:r>
+        <w:rPr>
+          <w:rFonts w:ascii="Cascadia Code" w:eastAsia="Times New Roman" w:hAnsi="Cascadia Code" w:cs="Cascadia Code"/>
+          <w:sz w:val="21"/>
+          <w:szCs w:val="21"/>
+          <w:lang w:eastAsia="en-IN"/>
+        </w:rPr>
+        <w:t>    &lt;meta charset="UTF-8"&gt;</w:t>
+      </w:r>
+    </w:p>
+    <w:p>
+      <w:pPr>
+        <w:shd w:val="clear" w:color="auto" w:fill="DBDBDB"/>
+        <w:spacing w:after="0" w:line="285" w:lineRule="atLeast"/>
+        <w:rPr>
+          <w:rFonts w:ascii="Cascadia Code" w:eastAsia="Times New Roman" w:hAnsi="Cascadia Code" w:cs="Cascadia Code"/>
+          <w:sz w:val="21"/>
+          <w:szCs w:val="21"/>
+          <w:lang w:eastAsia="en-IN"/>
+        </w:rPr>
+      </w:pPr>
+      <w:r>
+        <w:rPr>
+          <w:rFonts w:ascii="Cascadia Code" w:eastAsia="Times New Roman" w:hAnsi="Cascadia Code" w:cs="Cascadia Code"/>
+          <w:sz w:val="21"/>
+          <w:szCs w:val="21"/>
+          <w:lang w:eastAsia="en-IN"/>
+        </w:rPr>
+        <w:t>    &lt;meta name="viewport" content="width=device-width, initial-scale=1.0"&gt;</w:t>
+      </w:r>
+    </w:p>
+    <w:p>
+      <w:pPr>
+        <w:shd w:val="clear" w:color="auto" w:fill="DBDBDB"/>
+        <w:spacing w:after="0" w:line="285" w:lineRule="atLeast"/>
+        <w:rPr>
+          <w:rFonts w:ascii="Cascadia Code" w:eastAsia="Times New Roman" w:hAnsi="Cascadia Code" w:cs="Cascadia Code"/>
+          <w:sz w:val="21"/>
+          <w:szCs w:val="21"/>
+          <w:lang w:eastAsia="en-IN"/>
+        </w:rPr>
+      </w:pPr>
+      <w:r>
+        <w:rPr>
+          <w:rFonts w:ascii="Cascadia Code" w:eastAsia="Times New Roman" w:hAnsi="Cascadia Code" w:cs="Cascadia Code"/>
+          <w:sz w:val="21"/>
+          <w:szCs w:val="21"/>
+          <w:lang w:eastAsia="en-IN"/>
+        </w:rPr>
+        <w:t>    &lt;title&gt;Document&lt;/title&gt;</w:t>
+      </w:r>
+    </w:p>
+    <w:p>
+      <w:pPr>
+        <w:shd w:val="clear" w:color="auto" w:fill="DBDBDB"/>
+        <w:spacing w:after="0" w:line="285" w:lineRule="atLeast"/>
+        <w:rPr>
+          <w:rFonts w:ascii="Cascadia Code" w:eastAsia="Times New Roman" w:hAnsi="Cascadia Code" w:cs="Cascadia Code"/>
+          <w:sz w:val="21"/>
+          <w:szCs w:val="21"/>
+          <w:lang w:eastAsia="en-IN"/>
+        </w:rPr>
+      </w:pPr>
+      <w:r>
+        <w:rPr>
+          <w:rFonts w:ascii="Cascadia Code" w:eastAsia="Times New Roman" w:hAnsi="Cascadia Code" w:cs="Cascadia Code"/>
+          <w:sz w:val="21"/>
+          <w:szCs w:val="21"/>
+          <w:lang w:eastAsia="en-IN"/>
+        </w:rPr>
+        <w:t>&lt;/head&gt;</w:t>
+      </w:r>
+    </w:p>
+    <w:p>
+      <w:pPr>
+        <w:shd w:val="clear" w:color="auto" w:fill="DBDBDB"/>
+        <w:spacing w:after="0" w:line="285" w:lineRule="atLeast"/>
+        <w:rPr>
+          <w:rFonts w:ascii="Cascadia Code" w:eastAsia="Times New Roman" w:hAnsi="Cascadia Code" w:cs="Cascadia Code"/>
+          <w:sz w:val="21"/>
+          <w:szCs w:val="21"/>
+          <w:lang w:eastAsia="en-IN"/>
+        </w:rPr>
+      </w:pPr>
+      <w:r>
+        <w:rPr>
+          <w:rFonts w:ascii="Cascadia Code" w:eastAsia="Times New Roman" w:hAnsi="Cascadia Code" w:cs="Cascadia Code"/>
+          <w:sz w:val="21"/>
+          <w:szCs w:val="21"/>
+          <w:lang w:eastAsia="en-IN"/>
+        </w:rPr>
+        <w:t>&lt;body&gt;</w:t>
+      </w:r>
+    </w:p>
+    <w:p>
+      <w:pPr>
+        <w:shd w:val="clear" w:color="auto" w:fill="DBDBDB"/>
+        <w:spacing w:after="0" w:line="285" w:lineRule="atLeast"/>
+        <w:rPr>
+          <w:rFonts w:ascii="Cascadia Code" w:eastAsia="Times New Roman" w:hAnsi="Cascadia Code" w:cs="Cascadia Code"/>
+          <w:sz w:val="21"/>
+          <w:szCs w:val="21"/>
+          <w:lang w:eastAsia="en-IN"/>
+        </w:rPr>
+      </w:pPr>
+      <w:r>
+        <w:rPr>
+          <w:rFonts w:ascii="Cascadia Code" w:eastAsia="Times New Roman" w:hAnsi="Cascadia Code" w:cs="Cascadia Code"/>
+          <w:sz w:val="21"/>
+          <w:szCs w:val="21"/>
+          <w:lang w:eastAsia="en-IN"/>
+        </w:rPr>
+        <w:t>    &lt;table&gt;</w:t>
+      </w:r>
+    </w:p>
+    <w:p>
+      <w:pPr>
+        <w:shd w:val="clear" w:color="auto" w:fill="DBDBDB"/>
+        <w:spacing w:after="0" w:line="285" w:lineRule="atLeast"/>
+        <w:rPr>
+          <w:rFonts w:ascii="Cascadia Code" w:eastAsia="Times New Roman" w:hAnsi="Cascadia Code" w:cs="Cascadia Code"/>
+          <w:sz w:val="21"/>
+          <w:szCs w:val="21"/>
+          <w:lang w:eastAsia="en-IN"/>
+        </w:rPr>
+      </w:pPr>
+      <w:r>
+        <w:rPr>
+          <w:rFonts w:ascii="Cascadia Code" w:eastAsia="Times New Roman" w:hAnsi="Cascadia Code" w:cs="Cascadia Code"/>
+          <w:sz w:val="21"/>
+          <w:szCs w:val="21"/>
+          <w:lang w:eastAsia="en-IN"/>
+        </w:rPr>
+        <w:t>        &lt;tr&gt;</w:t>
+      </w:r>
+    </w:p>
+    <w:p>
+      <w:pPr>
+        <w:shd w:val="clear" w:color="auto" w:fill="DBDBDB"/>
+        <w:spacing w:after="0" w:line="285" w:lineRule="atLeast"/>
+        <w:rPr>
+          <w:rFonts w:ascii="Cascadia Code" w:eastAsia="Times New Roman" w:hAnsi="Cascadia Code" w:cs="Cascadia Code"/>
+          <w:sz w:val="21"/>
+          <w:szCs w:val="21"/>
+          <w:lang w:eastAsia="en-IN"/>
+        </w:rPr>
+      </w:pPr>
+      <w:r>
+        <w:rPr>
+          <w:rFonts w:ascii="Cascadia Code" w:eastAsia="Times New Roman" w:hAnsi="Cascadia Code" w:cs="Cascadia Code"/>
+          <w:sz w:val="21"/>
+          <w:szCs w:val="21"/>
+          <w:lang w:eastAsia="en-IN"/>
+        </w:rPr>
+        <w:t>            &lt;</w:t>
+      </w:r>
+      <w:proofErr w:type="spellStart"/>
+      <w:r>
+        <w:rPr>
+          <w:rFonts w:ascii="Cascadia Code" w:eastAsia="Times New Roman" w:hAnsi="Cascadia Code" w:cs="Cascadia Code"/>
+          <w:sz w:val="21"/>
+          <w:szCs w:val="21"/>
+          <w:lang w:eastAsia="en-IN"/>
+        </w:rPr>
+        <w:t>th</w:t>
+      </w:r>
+      <w:proofErr w:type="spellEnd"/>
+      <w:r>
+        <w:rPr>
+          <w:rFonts w:ascii="Cascadia Code" w:eastAsia="Times New Roman" w:hAnsi="Cascadia Code" w:cs="Cascadia Code"/>
+          <w:sz w:val="21"/>
+          <w:szCs w:val="21"/>
+          <w:lang w:eastAsia="en-IN"/>
+        </w:rPr>
+        <w:t>&gt;Name&lt;/</w:t>
+      </w:r>
+      <w:proofErr w:type="spellStart"/>
+      <w:r>
+        <w:rPr>
+          <w:rFonts w:ascii="Cascadia Code" w:eastAsia="Times New Roman" w:hAnsi="Cascadia Code" w:cs="Cascadia Code"/>
+          <w:sz w:val="21"/>
+          <w:szCs w:val="21"/>
+          <w:lang w:eastAsia="en-IN"/>
+        </w:rPr>
+        <w:t>th</w:t>
+      </w:r>
+      <w:proofErr w:type="spellEnd"/>
+      <w:r>
+        <w:rPr>
+          <w:rFonts w:ascii="Cascadia Code" w:eastAsia="Times New Roman" w:hAnsi="Cascadia Code" w:cs="Cascadia Code"/>
+          <w:sz w:val="21"/>
+          <w:szCs w:val="21"/>
+          <w:lang w:eastAsia="en-IN"/>
+        </w:rPr>
+        <w:t>&gt;</w:t>
+      </w:r>
+    </w:p>
+    <w:p>
+      <w:pPr>
+        <w:shd w:val="clear" w:color="auto" w:fill="DBDBDB"/>
+        <w:spacing w:after="0" w:line="285" w:lineRule="atLeast"/>
+        <w:rPr>
+          <w:rFonts w:ascii="Cascadia Code" w:eastAsia="Times New Roman" w:hAnsi="Cascadia Code" w:cs="Cascadia Code"/>
+          <w:sz w:val="21"/>
+          <w:szCs w:val="21"/>
+          <w:lang w:eastAsia="en-IN"/>
+        </w:rPr>
+      </w:pPr>
+      <w:r>
+        <w:rPr>
+          <w:rFonts w:ascii="Cascadia Code" w:eastAsia="Times New Roman" w:hAnsi="Cascadia Code" w:cs="Cascadia Code"/>
+          <w:sz w:val="21"/>
+          <w:szCs w:val="21"/>
+          <w:lang w:eastAsia="en-IN"/>
+        </w:rPr>
+        <w:t>            &lt;</w:t>
+      </w:r>
+      <w:proofErr w:type="spellStart"/>
+      <w:r>
+        <w:rPr>
+          <w:rFonts w:ascii="Cascadia Code" w:eastAsia="Times New Roman" w:hAnsi="Cascadia Code" w:cs="Cascadia Code"/>
+          <w:sz w:val="21"/>
+          <w:szCs w:val="21"/>
+          <w:lang w:eastAsia="en-IN"/>
+        </w:rPr>
+        <w:t>th</w:t>
+      </w:r>
+      <w:proofErr w:type="spellEnd"/>
+      <w:r>
+        <w:rPr>
+          <w:rFonts w:ascii="Cascadia Code" w:eastAsia="Times New Roman" w:hAnsi="Cascadia Code" w:cs="Cascadia Code"/>
+          <w:sz w:val="21"/>
+          <w:szCs w:val="21"/>
+          <w:lang w:eastAsia="en-IN"/>
+        </w:rPr>
+        <w:t>&gt;Contact&lt;/</w:t>
+      </w:r>
+      <w:proofErr w:type="spellStart"/>
+      <w:r>
+        <w:rPr>
+          <w:rFonts w:ascii="Cascadia Code" w:eastAsia="Times New Roman" w:hAnsi="Cascadia Code" w:cs="Cascadia Code"/>
+          <w:sz w:val="21"/>
+          <w:szCs w:val="21"/>
+          <w:lang w:eastAsia="en-IN"/>
+        </w:rPr>
+        <w:t>th</w:t>
+      </w:r>
+      <w:proofErr w:type="spellEnd"/>
+      <w:r>
+        <w:rPr>
+          <w:rFonts w:ascii="Cascadia Code" w:eastAsia="Times New Roman" w:hAnsi="Cascadia Code" w:cs="Cascadia Code"/>
+          <w:sz w:val="21"/>
+          <w:szCs w:val="21"/>
+          <w:lang w:eastAsia="en-IN"/>
+        </w:rPr>
+        <w:t>&gt;</w:t>
+      </w:r>
+    </w:p>
+    <w:p>
+      <w:pPr>
+        <w:shd w:val="clear" w:color="auto" w:fill="DBDBDB"/>
+        <w:spacing w:after="0" w:line="285" w:lineRule="atLeast"/>
+        <w:rPr>
+          <w:rFonts w:ascii="Cascadia Code" w:eastAsia="Times New Roman" w:hAnsi="Cascadia Code" w:cs="Cascadia Code"/>
+          <w:sz w:val="21"/>
+          <w:szCs w:val="21"/>
+          <w:lang w:eastAsia="en-IN"/>
+        </w:rPr>
+      </w:pPr>
+      <w:r>
+        <w:rPr>
+          <w:rFonts w:ascii="Cascadia Code" w:eastAsia="Times New Roman" w:hAnsi="Cascadia Code" w:cs="Cascadia Code"/>
+          <w:sz w:val="21"/>
+          <w:szCs w:val="21"/>
+          <w:lang w:eastAsia="en-IN"/>
+        </w:rPr>
+        <w:t>            &lt;</w:t>
+      </w:r>
+      <w:proofErr w:type="spellStart"/>
+      <w:r>
+        <w:rPr>
+          <w:rFonts w:ascii="Cascadia Code" w:eastAsia="Times New Roman" w:hAnsi="Cascadia Code" w:cs="Cascadia Code"/>
+          <w:sz w:val="21"/>
+          <w:szCs w:val="21"/>
+          <w:lang w:eastAsia="en-IN"/>
+        </w:rPr>
+        <w:t>th</w:t>
+      </w:r>
+      <w:proofErr w:type="spellEnd"/>
+      <w:r>
+        <w:rPr>
+          <w:rFonts w:ascii="Cascadia Code" w:eastAsia="Times New Roman" w:hAnsi="Cascadia Code" w:cs="Cascadia Code"/>
+          <w:sz w:val="21"/>
+          <w:szCs w:val="21"/>
+          <w:lang w:eastAsia="en-IN"/>
+        </w:rPr>
+        <w:t>&gt;Roll No&lt;/</w:t>
+      </w:r>
+      <w:proofErr w:type="spellStart"/>
+      <w:r>
+        <w:rPr>
+          <w:rFonts w:ascii="Cascadia Code" w:eastAsia="Times New Roman" w:hAnsi="Cascadia Code" w:cs="Cascadia Code"/>
+          <w:sz w:val="21"/>
+          <w:szCs w:val="21"/>
+          <w:lang w:eastAsia="en-IN"/>
+        </w:rPr>
+        <w:t>th</w:t>
+      </w:r>
+      <w:proofErr w:type="spellEnd"/>
+      <w:r>
+        <w:rPr>
+          <w:rFonts w:ascii="Cascadia Code" w:eastAsia="Times New Roman" w:hAnsi="Cascadia Code" w:cs="Cascadia Code"/>
+          <w:sz w:val="21"/>
+          <w:szCs w:val="21"/>
+          <w:lang w:eastAsia="en-IN"/>
+        </w:rPr>
+        <w:t>&gt;</w:t>
+      </w:r>
+    </w:p>
+    <w:p>
+      <w:pPr>
+        <w:shd w:val="clear" w:color="auto" w:fill="DBDBDB"/>
+        <w:spacing w:after="0" w:line="285" w:lineRule="atLeast"/>
+        <w:rPr>
+          <w:rFonts w:ascii="Cascadia Code" w:eastAsia="Times New Roman" w:hAnsi="Cascadia Code" w:cs="Cascadia Code"/>
+          <w:sz w:val="21"/>
+          <w:szCs w:val="21"/>
+          <w:lang w:eastAsia="en-IN"/>
+        </w:rPr>
+      </w:pPr>
+      <w:r>
+        <w:rPr>
+          <w:rFonts w:ascii="Cascadia Code" w:eastAsia="Times New Roman" w:hAnsi="Cascadia Code" w:cs="Cascadia Code"/>
+          <w:sz w:val="21"/>
+          <w:szCs w:val="21"/>
+          <w:lang w:eastAsia="en-IN"/>
+        </w:rPr>
+        <w:t>        &lt;/tr&gt;</w:t>
+      </w:r>
+    </w:p>
+    <w:p>
+      <w:pPr>
+        <w:shd w:val="clear" w:color="auto" w:fill="DBDBDB"/>
+        <w:spacing w:after="0" w:line="285" w:lineRule="atLeast"/>
+        <w:rPr>
+          <w:rFonts w:ascii="Cascadia Code" w:eastAsia="Times New Roman" w:hAnsi="Cascadia Code" w:cs="Cascadia Code"/>
+          <w:sz w:val="21"/>
+          <w:szCs w:val="21"/>
+          <w:lang w:eastAsia="en-IN"/>
+        </w:rPr>
+      </w:pPr>
+      <w:r>
+        <w:rPr>
+          <w:rFonts w:ascii="Cascadia Code" w:eastAsia="Times New Roman" w:hAnsi="Cascadia Code" w:cs="Cascadia Code"/>
+          <w:sz w:val="21"/>
+          <w:szCs w:val="21"/>
+          <w:lang w:eastAsia="en-IN"/>
+        </w:rPr>
+        <w:t>        &lt;tr&gt;</w:t>
+      </w:r>
+    </w:p>
+    <w:p>
+      <w:pPr>
+        <w:shd w:val="clear" w:color="auto" w:fill="DBDBDB"/>
+        <w:spacing w:after="0" w:line="285" w:lineRule="atLeast"/>
+        <w:rPr>
+          <w:rFonts w:ascii="Cascadia Code" w:eastAsia="Times New Roman" w:hAnsi="Cascadia Code" w:cs="Cascadia Code"/>
+          <w:sz w:val="21"/>
+          <w:szCs w:val="21"/>
+          <w:lang w:eastAsia="en-IN"/>
+        </w:rPr>
+      </w:pPr>
+      <w:r>
+        <w:rPr>
+          <w:rFonts w:ascii="Cascadia Code" w:eastAsia="Times New Roman" w:hAnsi="Cascadia Code" w:cs="Cascadia Code"/>
+          <w:sz w:val="21"/>
+          <w:szCs w:val="21"/>
+          <w:lang w:eastAsia="en-IN"/>
+        </w:rPr>
+        <w:t>            &lt;td&gt;Darshil Kumar&lt;/td&gt;</w:t>
+      </w:r>
+    </w:p>
+    <w:p>
+      <w:pPr>
+        <w:shd w:val="clear" w:color="auto" w:fill="DBDBDB"/>
+        <w:spacing w:after="0" w:line="285" w:lineRule="atLeast"/>
+        <w:rPr>
+          <w:rFonts w:ascii="Cascadia Code" w:eastAsia="Times New Roman" w:hAnsi="Cascadia Code" w:cs="Cascadia Code"/>
+          <w:sz w:val="21"/>
+          <w:szCs w:val="21"/>
+          <w:lang w:eastAsia="en-IN"/>
+        </w:rPr>
+      </w:pPr>
+      <w:r>
+        <w:rPr>
+          <w:rFonts w:ascii="Cascadia Code" w:eastAsia="Times New Roman" w:hAnsi="Cascadia Code" w:cs="Cascadia Code"/>
+          <w:sz w:val="21"/>
+          <w:szCs w:val="21"/>
+          <w:lang w:eastAsia="en-IN"/>
+        </w:rPr>
+        <w:t>            &lt;td&gt;7678163042&lt;/td&gt;</w:t>
+      </w:r>
+    </w:p>
+    <w:p>
+      <w:pPr>
+        <w:shd w:val="clear" w:color="auto" w:fill="DBDBDB"/>
+        <w:spacing w:after="0" w:line="285" w:lineRule="atLeast"/>
+        <w:rPr>
+          <w:rFonts w:ascii="Cascadia Code" w:eastAsia="Times New Roman" w:hAnsi="Cascadia Code" w:cs="Cascadia Code"/>
+          <w:sz w:val="21"/>
+          <w:szCs w:val="21"/>
+          <w:lang w:eastAsia="en-IN"/>
+        </w:rPr>
+      </w:pPr>
+      <w:r>
+        <w:rPr>
+          <w:rFonts w:ascii="Cascadia Code" w:eastAsia="Times New Roman" w:hAnsi="Cascadia Code" w:cs="Cascadia Code"/>
+          <w:sz w:val="21"/>
+          <w:szCs w:val="21"/>
+          <w:lang w:eastAsia="en-IN"/>
+        </w:rPr>
+        <w:t>            &lt;td&gt;2202900100071&lt;/td&gt;</w:t>
+      </w:r>
+    </w:p>
+    <w:p>
+      <w:pPr>
+        <w:shd w:val="clear" w:color="auto" w:fill="DBDBDB"/>
+        <w:spacing w:after="0" w:line="285" w:lineRule="atLeast"/>
+        <w:rPr>
+          <w:rFonts w:ascii="Cascadia Code" w:eastAsia="Times New Roman" w:hAnsi="Cascadia Code" w:cs="Cascadia Code"/>
+          <w:sz w:val="21"/>
+          <w:szCs w:val="21"/>
+          <w:lang w:eastAsia="en-IN"/>
+        </w:rPr>
+      </w:pPr>
+      <w:r>
+        <w:rPr>
+          <w:rFonts w:ascii="Cascadia Code" w:eastAsia="Times New Roman" w:hAnsi="Cascadia Code" w:cs="Cascadia Code"/>
+          <w:sz w:val="21"/>
+          <w:szCs w:val="21"/>
+          <w:lang w:eastAsia="en-IN"/>
+        </w:rPr>
+        <w:t>        &lt;/tr&gt;</w:t>
+      </w:r>
+    </w:p>
+    <w:p>
+      <w:pPr>
+        <w:shd w:val="clear" w:color="auto" w:fill="DBDBDB"/>
+        <w:spacing w:after="0" w:line="285" w:lineRule="atLeast"/>
+        <w:rPr>
+          <w:rFonts w:ascii="Cascadia Code" w:eastAsia="Times New Roman" w:hAnsi="Cascadia Code" w:cs="Cascadia Code"/>
+          <w:sz w:val="21"/>
+          <w:szCs w:val="21"/>
+          <w:lang w:eastAsia="en-IN"/>
+        </w:rPr>
+      </w:pPr>
+      <w:r>
+        <w:rPr>
+          <w:rFonts w:ascii="Cascadia Code" w:eastAsia="Times New Roman" w:hAnsi="Cascadia Code" w:cs="Cascadia Code"/>
+          <w:sz w:val="21"/>
+          <w:szCs w:val="21"/>
+          <w:lang w:eastAsia="en-IN"/>
+        </w:rPr>
+        <w:t>        &lt;tr&gt;</w:t>
+      </w:r>
+    </w:p>
+    <w:p>
+      <w:pPr>
+        <w:shd w:val="clear" w:color="auto" w:fill="DBDBDB"/>
+        <w:spacing w:after="0" w:line="285" w:lineRule="atLeast"/>
+        <w:rPr>
+          <w:rFonts w:ascii="Cascadia Code" w:eastAsia="Times New Roman" w:hAnsi="Cascadia Code" w:cs="Cascadia Code"/>
+          <w:sz w:val="21"/>
+          <w:szCs w:val="21"/>
+          <w:lang w:eastAsia="en-IN"/>
+        </w:rPr>
+      </w:pPr>
+      <w:r>
+        <w:rPr>
+          <w:rFonts w:ascii="Cascadia Code" w:eastAsia="Times New Roman" w:hAnsi="Cascadia Code" w:cs="Cascadia Code"/>
+          <w:sz w:val="21"/>
+          <w:szCs w:val="21"/>
+          <w:lang w:eastAsia="en-IN"/>
+        </w:rPr>
+        <w:t>            &lt;td&gt;Devansh Singh&lt;/td&gt;</w:t>
+      </w:r>
+    </w:p>
+    <w:p>
+      <w:pPr>
+        <w:shd w:val="clear" w:color="auto" w:fill="DBDBDB"/>
+        <w:spacing w:after="0" w:line="285" w:lineRule="atLeast"/>
+        <w:rPr>
+          <w:rFonts w:ascii="Cascadia Code" w:eastAsia="Times New Roman" w:hAnsi="Cascadia Code" w:cs="Cascadia Code"/>
+          <w:sz w:val="21"/>
+          <w:szCs w:val="21"/>
+          <w:lang w:eastAsia="en-IN"/>
+        </w:rPr>
+      </w:pPr>
+      <w:r>
+        <w:rPr>
+          <w:rFonts w:ascii="Cascadia Code" w:eastAsia="Times New Roman" w:hAnsi="Cascadia Code" w:cs="Cascadia Code"/>
+          <w:sz w:val="21"/>
+          <w:szCs w:val="21"/>
+          <w:lang w:eastAsia="en-IN"/>
+        </w:rPr>
+        <w:t>            &lt;td&gt;9999988888&lt;/td&gt;</w:t>
+      </w:r>
+    </w:p>
+    <w:p>
+      <w:pPr>
+        <w:shd w:val="clear" w:color="auto" w:fill="DBDBDB"/>
+        <w:spacing w:after="0" w:line="285" w:lineRule="atLeast"/>
+        <w:rPr>
+          <w:rFonts w:ascii="Cascadia Code" w:eastAsia="Times New Roman" w:hAnsi="Cascadia Code" w:cs="Cascadia Code"/>
+          <w:sz w:val="21"/>
+          <w:szCs w:val="21"/>
+          <w:lang w:eastAsia="en-IN"/>
+        </w:rPr>
+      </w:pPr>
+      <w:r>
+        <w:rPr>
+          <w:rFonts w:ascii="Cascadia Code" w:eastAsia="Times New Roman" w:hAnsi="Cascadia Code" w:cs="Cascadia Code"/>
+          <w:sz w:val="21"/>
+          <w:szCs w:val="21"/>
+          <w:lang w:eastAsia="en-IN"/>
+        </w:rPr>
+        <w:t>            &lt;td&gt;2202900100071&lt;/td&gt;</w:t>
+      </w:r>
+    </w:p>
+    <w:p>
+      <w:pPr>
+        <w:shd w:val="clear" w:color="auto" w:fill="DBDBDB"/>
+        <w:spacing w:after="0" w:line="285" w:lineRule="atLeast"/>
+        <w:rPr>
+          <w:rFonts w:ascii="Cascadia Code" w:eastAsia="Times New Roman" w:hAnsi="Cascadia Code" w:cs="Cascadia Code"/>
+          <w:sz w:val="21"/>
+          <w:szCs w:val="21"/>
+          <w:lang w:eastAsia="en-IN"/>
+        </w:rPr>
+      </w:pPr>
+      <w:r>
+        <w:rPr>
+          <w:rFonts w:ascii="Cascadia Code" w:eastAsia="Times New Roman" w:hAnsi="Cascadia Code" w:cs="Cascadia Code"/>
+          <w:sz w:val="21"/>
+          <w:szCs w:val="21"/>
+          <w:lang w:eastAsia="en-IN"/>
+        </w:rPr>
+        <w:t>        &lt;/tr&gt;</w:t>
+      </w:r>
+    </w:p>
+    <w:p>
+      <w:pPr>
+        <w:shd w:val="clear" w:color="auto" w:fill="DBDBDB"/>
+        <w:spacing w:after="0" w:line="285" w:lineRule="atLeast"/>
+        <w:rPr>
+          <w:rFonts w:ascii="Cascadia Code" w:eastAsia="Times New Roman" w:hAnsi="Cascadia Code" w:cs="Cascadia Code"/>
+          <w:sz w:val="21"/>
+          <w:szCs w:val="21"/>
+          <w:lang w:eastAsia="en-IN"/>
+        </w:rPr>
+      </w:pPr>
+      <w:r>
+        <w:rPr>
+          <w:rFonts w:ascii="Cascadia Code" w:eastAsia="Times New Roman" w:hAnsi="Cascadia Code" w:cs="Cascadia Code"/>
+          <w:sz w:val="21"/>
+          <w:szCs w:val="21"/>
+          <w:lang w:eastAsia="en-IN"/>
+        </w:rPr>
+        <w:t>        &lt;tr&gt;</w:t>
+      </w:r>
+    </w:p>
+    <w:p>
+      <w:pPr>
+        <w:shd w:val="clear" w:color="auto" w:fill="DBDBDB"/>
+        <w:spacing w:after="0" w:line="285" w:lineRule="atLeast"/>
+        <w:rPr>
+          <w:rFonts w:ascii="Cascadia Code" w:eastAsia="Times New Roman" w:hAnsi="Cascadia Code" w:cs="Cascadia Code"/>
+          <w:sz w:val="21"/>
+          <w:szCs w:val="21"/>
+          <w:lang w:eastAsia="en-IN"/>
+        </w:rPr>
+      </w:pPr>
+      <w:r>
+        <w:rPr>
+          <w:rFonts w:ascii="Cascadia Code" w:eastAsia="Times New Roman" w:hAnsi="Cascadia Code" w:cs="Cascadia Code"/>
+          <w:sz w:val="21"/>
+          <w:szCs w:val="21"/>
+          <w:lang w:eastAsia="en-IN"/>
+        </w:rPr>
+        <w:t>            &lt;td&gt;Ishmeet Singh Sodhi&lt;/td&gt;</w:t>
+      </w:r>
+    </w:p>
+    <w:p>
+      <w:pPr>
+        <w:shd w:val="clear" w:color="auto" w:fill="DBDBDB"/>
+        <w:spacing w:after="0" w:line="285" w:lineRule="atLeast"/>
+        <w:rPr>
+          <w:rFonts w:ascii="Cascadia Code" w:eastAsia="Times New Roman" w:hAnsi="Cascadia Code" w:cs="Cascadia Code"/>
+          <w:sz w:val="21"/>
+          <w:szCs w:val="21"/>
+          <w:lang w:eastAsia="en-IN"/>
+        </w:rPr>
+      </w:pPr>
+      <w:r>
+        <w:rPr>
+          <w:rFonts w:ascii="Cascadia Code" w:eastAsia="Times New Roman" w:hAnsi="Cascadia Code" w:cs="Cascadia Code"/>
+          <w:sz w:val="21"/>
+          <w:szCs w:val="21"/>
+          <w:lang w:eastAsia="en-IN"/>
+        </w:rPr>
+        <w:t>            &lt;td&gt;</w:t>
+      </w:r>
+      <w:r>
+        <w:t xml:space="preserve"> </w:t>
+      </w:r>
+      <w:r>
+        <w:rPr>
+          <w:rFonts w:ascii="Cascadia Code" w:eastAsia="Times New Roman" w:hAnsi="Cascadia Code" w:cs="Cascadia Code"/>
+          <w:sz w:val="21"/>
+          <w:szCs w:val="21"/>
+          <w:lang w:eastAsia="en-IN"/>
+        </w:rPr>
+        <w:t>1111122222&lt;/td&gt;</w:t>
+      </w:r>
+    </w:p>
+    <w:p>
+      <w:pPr>
+        <w:shd w:val="clear" w:color="auto" w:fill="DBDBDB"/>
+        <w:spacing w:after="0" w:line="285" w:lineRule="atLeast"/>
+        <w:rPr>
+          <w:rFonts w:ascii="Cascadia Code" w:eastAsia="Times New Roman" w:hAnsi="Cascadia Code" w:cs="Cascadia Code"/>
+          <w:sz w:val="21"/>
+          <w:szCs w:val="21"/>
+          <w:lang w:eastAsia="en-IN"/>
+        </w:rPr>
+      </w:pPr>
+      <w:r>
+        <w:rPr>
+          <w:rFonts w:ascii="Cascadia Code" w:eastAsia="Times New Roman" w:hAnsi="Cascadia Code" w:cs="Cascadia Code"/>
+          <w:sz w:val="21"/>
+          <w:szCs w:val="21"/>
+          <w:lang w:eastAsia="en-IN"/>
+        </w:rPr>
+        <w:t>            &lt;td&gt;2202900100075&lt;/td&gt;</w:t>
+      </w:r>
+    </w:p>
+    <w:p>
+      <w:pPr>
+        <w:shd w:val="clear" w:color="auto" w:fill="DBDBDB"/>
+        <w:spacing w:after="0" w:line="285" w:lineRule="atLeast"/>
+        <w:rPr>
+          <w:rFonts w:ascii="Cascadia Code" w:eastAsia="Times New Roman" w:hAnsi="Cascadia Code" w:cs="Cascadia Code"/>
+          <w:sz w:val="21"/>
+          <w:szCs w:val="21"/>
+          <w:lang w:eastAsia="en-IN"/>
+        </w:rPr>
+      </w:pPr>
+      <w:r>
+        <w:rPr>
+          <w:rFonts w:ascii="Cascadia Code" w:eastAsia="Times New Roman" w:hAnsi="Cascadia Code" w:cs="Cascadia Code"/>
+          <w:sz w:val="21"/>
+          <w:szCs w:val="21"/>
+          <w:lang w:eastAsia="en-IN"/>
+        </w:rPr>
+        <w:t>        &lt;/tr&gt;</w:t>
+      </w:r>
+    </w:p>
+    <w:p>
+      <w:pPr>
+        <w:shd w:val="clear" w:color="auto" w:fill="DBDBDB"/>
+        <w:spacing w:after="0" w:line="285" w:lineRule="atLeast"/>
+        <w:rPr>
+          <w:rFonts w:ascii="Cascadia Code" w:eastAsia="Times New Roman" w:hAnsi="Cascadia Code" w:cs="Cascadia Code"/>
+          <w:sz w:val="21"/>
+          <w:szCs w:val="21"/>
+          <w:lang w:eastAsia="en-IN"/>
+        </w:rPr>
+      </w:pPr>
+      <w:r>
+        <w:rPr>
+          <w:rFonts w:ascii="Cascadia Code" w:eastAsia="Times New Roman" w:hAnsi="Cascadia Code" w:cs="Cascadia Code"/>
+          <w:sz w:val="21"/>
+          <w:szCs w:val="21"/>
+          <w:lang w:eastAsia="en-IN"/>
+        </w:rPr>
+        <w:t>    &lt;/table&gt;</w:t>
+      </w:r>
+    </w:p>
+    <w:p>
+      <w:pPr>
+        <w:shd w:val="clear" w:color="auto" w:fill="DBDBDB"/>
+        <w:spacing w:after="0" w:line="285" w:lineRule="atLeast"/>
+        <w:rPr>
+          <w:rFonts w:ascii="Cascadia Code" w:eastAsia="Times New Roman" w:hAnsi="Cascadia Code" w:cs="Cascadia Code"/>
+          <w:sz w:val="21"/>
+          <w:szCs w:val="21"/>
+          <w:lang w:eastAsia="en-IN"/>
+        </w:rPr>
+      </w:pPr>
+      <w:r>
+        <w:rPr>
+          <w:rFonts w:ascii="Cascadia Code" w:eastAsia="Times New Roman" w:hAnsi="Cascadia Code" w:cs="Cascadia Code"/>
+          <w:sz w:val="21"/>
+          <w:szCs w:val="21"/>
+          <w:lang w:eastAsia="en-IN"/>
+        </w:rPr>
+        <w:t xml:space="preserve">    </w:t>
+      </w:r>
+    </w:p>
+    <w:p>
+      <w:pPr>
+        <w:shd w:val="clear" w:color="auto" w:fill="DBDBDB"/>
+        <w:spacing w:after="0" w:line="285" w:lineRule="atLeast"/>
+        <w:rPr>
+          <w:rFonts w:ascii="Cascadia Code" w:eastAsia="Times New Roman" w:hAnsi="Cascadia Code" w:cs="Cascadia Code"/>
+          <w:sz w:val="21"/>
+          <w:szCs w:val="21"/>
+          <w:lang w:eastAsia="en-IN"/>
+        </w:rPr>
+      </w:pPr>
+      <w:r>
+        <w:rPr>
+          <w:rFonts w:ascii="Cascadia Code" w:eastAsia="Times New Roman" w:hAnsi="Cascadia Code" w:cs="Cascadia Code"/>
+          <w:sz w:val="21"/>
+          <w:szCs w:val="21"/>
+          <w:lang w:eastAsia="en-IN"/>
+        </w:rPr>
+        <w:t>&lt;/body&gt;</w:t>
+      </w:r>
+    </w:p>
+    <w:p>
+      <w:pPr>
+        <w:shd w:val="clear" w:color="auto" w:fill="DBDBDB"/>
+        <w:spacing w:after="0" w:line="285" w:lineRule="atLeast"/>
+        <w:rPr>
+          <w:rFonts w:ascii="Cascadia Code" w:eastAsia="Times New Roman" w:hAnsi="Cascadia Code" w:cs="Cascadia Code"/>
+          <w:sz w:val="21"/>
+          <w:szCs w:val="21"/>
+          <w:lang w:eastAsia="en-IN"/>
+        </w:rPr>
+      </w:pPr>
+      <w:r>
+        <w:rPr>
+          <w:rFonts w:ascii="Cascadia Code" w:eastAsia="Times New Roman" w:hAnsi="Cascadia Code" w:cs="Cascadia Code"/>
+          <w:sz w:val="21"/>
+          <w:szCs w:val="21"/>
+          <w:lang w:eastAsia="en-IN"/>
+        </w:rPr>
+        <w:t>&lt;/html&gt;</w:t>
+      </w:r>
+    </w:p>
+    <w:p>
+      <w:pPr>
+        <w:shd w:val="clear" w:color="auto" w:fill="DBDBDB"/>
+        <w:spacing w:after="0" w:line="285" w:lineRule="atLeast"/>
+        <w:rPr>
+          <w:rFonts w:ascii="Cascadia Code" w:eastAsia="Times New Roman" w:hAnsi="Cascadia Code" w:cs="Cascadia Code"/>
+          <w:sz w:val="21"/>
+          <w:szCs w:val="21"/>
+          <w:lang w:eastAsia="en-IN"/>
+        </w:rPr>
+      </w:pPr>
+    </w:p>
+    <w:p>
+      <w:pPr>
+        <w:shd w:val="clear" w:color="auto" w:fill="FFFFFF" w:themeFill="background1"/>
+        <w:spacing w:after="0" w:line="285" w:lineRule="atLeast"/>
+        <w:rPr>
+          <w:rFonts w:ascii="Cascadia Code" w:eastAsia="Times New Roman" w:hAnsi="Cascadia Code" w:cs="Cascadia Code"/>
+          <w:sz w:val="21"/>
+          <w:szCs w:val="21"/>
+          <w:lang w:eastAsia="en-IN"/>
+        </w:rPr>
+      </w:pPr>
+    </w:p>
+    <w:p>
+      <w:pPr>
+        <w:shd w:val="clear" w:color="auto" w:fill="FFFFFF" w:themeFill="background1"/>
+        <w:spacing w:after="0" w:line="285" w:lineRule="atLeast"/>
+        <w:rPr>
+          <w:rFonts w:ascii="Cascadia Code" w:eastAsia="Times New Roman" w:hAnsi="Cascadia Code" w:cs="Cascadia Code"/>
+          <w:b/>
+          <w:bCs/>
+          <w:sz w:val="24"/>
+          <w:szCs w:val="24"/>
+          <w:u w:val="single"/>
+          <w:lang w:eastAsia="en-IN"/>
+        </w:rPr>
+      </w:pPr>
+      <w:r>
+        <w:rPr>
+          <w:rFonts w:ascii="Cascadia Code" w:eastAsia="Times New Roman" w:hAnsi="Cascadia Code" w:cs="Cascadia Code"/>
+          <w:b/>
+          <w:bCs/>
+          <w:sz w:val="24"/>
+          <w:szCs w:val="24"/>
+          <w:u w:val="single"/>
+          <w:lang w:eastAsia="en-IN"/>
+        </w:rPr>
+        <w:t>OUTPUT:</w:t>
+      </w:r>
+    </w:p>
+    <w:p>
+      <w:pPr>
+        <w:shd w:val="clear" w:color="auto" w:fill="FFFFFF" w:themeFill="background1"/>
+        <w:spacing w:after="0" w:line="285" w:lineRule="atLeast"/>
+        <w:rPr>
+          <w:rFonts w:ascii="Cascadia Code" w:eastAsia="Times New Roman" w:hAnsi="Cascadia Code" w:cs="Cascadia Code"/>
+          <w:b/>
+          <w:bCs/>
+          <w:sz w:val="24"/>
+          <w:szCs w:val="24"/>
+          <w:u w:val="single"/>
+          <w:lang w:eastAsia="en-IN"/>
+        </w:rPr>
+      </w:pPr>
+    </w:p>
+    <w:p>
+      <w:pPr>
+        <w:shd w:val="clear" w:color="auto" w:fill="FFFFFF" w:themeFill="background1"/>
+        <w:spacing w:after="0" w:line="285" w:lineRule="atLeast"/>
+        <w:rPr>
+          <w:rFonts w:ascii="Cascadia Code" w:eastAsia="Times New Roman" w:hAnsi="Cascadia Code" w:cs="Cascadia Code"/>
+          <w:b/>
+          <w:bCs/>
+          <w:sz w:val="24"/>
+          <w:szCs w:val="24"/>
+          <w:u w:val="single"/>
+          <w:lang w:eastAsia="en-IN"/>
+        </w:rPr>
+      </w:pPr>
+      <w:r>
+        <w:rPr>
+          <w:rFonts w:ascii="Cascadia Code" w:eastAsia="Times New Roman" w:hAnsi="Cascadia Code" w:cs="Cascadia Code"/>
+          <w:b/>
+          <w:bCs/>
+          <w:sz w:val="24"/>
+          <w:szCs w:val="24"/>
+          <w:lang w:eastAsia="en-IN"/>
+        </w:rPr>
+        <w:drawing>
+          <wp:inline distT="0" distB="0" distL="0" distR="0" wp14:anchorId="107F9A73" wp14:editId="5F1F84C8">
+            <wp:extent cx="5731510" cy="1596390"/>
+            <wp:effectExtent l="19050" t="19050" r="21590" b="22860"/>
+            <wp:docPr id="737153014" name="Picture 1"/>
+            <wp:cNvGraphicFramePr>
+              <a:graphicFrameLocks xmlns:a="http://schemas.openxmlformats.org/drawingml/2006/main" noChangeAspect="1"/>
+            </wp:cNvGraphicFramePr>
+            <a:graphic xmlns:a="http://schemas.openxmlformats.org/drawingml/2006/main">
+              <a:graphicData uri="http://schemas.openxmlformats.org/drawingml/2006/picture">
+                <pic:pic xmlns:pic="http://schemas.openxmlformats.org/drawingml/2006/picture">
+                  <pic:nvPicPr>
+                    <pic:cNvPr id="737153014" name=""/>
+                    <pic:cNvPicPr/>
+                  </pic:nvPicPr>
+                  <pic:blipFill rotWithShape="1">
+                    <a:blip r:embed="rId7"/>
+                    <a:srcRect t="1772" b="41157"/>
+                    <a:stretch/>
+                  </pic:blipFill>
+                  <pic:spPr bwMode="auto">
+                    <a:xfrm>
+                      <a:off x="0" y="0"/>
+                      <a:ext cx="5731510" cy="1596390"/>
+                    </a:xfrm>
+                    <a:prstGeom prst="rect">
+                      <a:avLst/>
+                    </a:prstGeom>
+                    <a:ln w="6350" cap="flat" cmpd="sng" algn="ctr">
+                      <a:solidFill>
+                        <a:srgbClr val="44546A"/>
+                      </a:solidFill>
+                      <a:prstDash val="solid"/>
+                      <a:round/>
+                      <a:headEnd type="none" w="med" len="med"/>
+                      <a:tailEnd type="none" w="med" len="med"/>
+                      <a:extLst>
+                        <a:ext uri="{C807C97D-BFC1-408E-A445-0C87EB9F89A2}">
+                          <ask:lineSketchStyleProps xmlns:ask="http://schemas.microsoft.com/office/drawing/2018/sketchyshapes" sd="0">
+                            <a:custGeom>
+                              <a:avLst/>
+                              <a:gdLst/>
+                              <a:ahLst/>
+                              <a:cxnLst/>
+                              <a:rect l="0" t="0" r="0" b="0"/>
+                              <a:pathLst/>
+                            </a:custGeom>
+                            <ask:type/>
+                          </ask:lineSketchStyleProps>
+                        </a:ext>
+                      </a:extLst>
+                    </a:ln>
+                    <a:extLst>
+                      <a:ext uri="{53640926-AAD7-44D8-BBD7-CCE9431645EC}">
+                        <a14:shadowObscured xmlns:a14="http://schemas.microsoft.com/office/drawing/2010/main"/>
+                      </a:ext>
+                    </a:extLst>
+                  </pic:spPr>
+                </pic:pic>
+              </a:graphicData>
+            </a:graphic>
+          </wp:inline>
+        </w:drawing>
+      </w:r>
     </w:p>
     <w:p>
       <w:pPr>

</xml_diff>